<commit_message>
One simple neutral two-page note (FR + EN) replaces all variants; no partner pitch
Co-Authored-By: Claude Fable 5 <noreply@anthropic.com>
Claude-Session: https://claude.ai/code/session_01Pijyy83JyS8bJxoVQgxwZB
</commit_message>
<xml_diff>
--- a/04-other-documents/data-access/02-project-note-en.docx
+++ b/04-other-documents/data-access/02-project-note-en.docx
@@ -92,29 +92,79 @@
         <w:t xml:space="preserve"> </w:t>
       </w:r>
       <w:r>
-        <w:t xml:space="preserve">because nobody has established whether doing so helps or harms. That is the project’s central</w:t>
-      </w:r>
-      <w:r>
-        <w:t xml:space="preserve"> </w:t>
-      </w:r>
-      <w:r>
-        <w:t xml:space="preserve">question, posed falsifiably, from extraction all the way to a running, prospectively verified</w:t>
-      </w:r>
-      <w:r>
-        <w:t xml:space="preserve"> </w:t>
-      </w:r>
-      <w:r>
-        <w:t xml:space="preserve">system.</w:t>
+        <w:t xml:space="preserve">because nobody has established whether doing so helps or harms.</w:t>
       </w:r>
     </w:p>
     <w:bookmarkEnd w:id="20"/>
-    <w:bookmarkStart w:id="21" w:name="where-the-project-comes-from"/>
+    <w:bookmarkStart w:id="21" w:name="the-question"/>
     <w:p>
       <w:pPr>
         <w:pStyle w:val="Heading2"/>
       </w:pPr>
       <w:r>
-        <w:t xml:space="preserve">Where the project comes from</w:t>
+        <w:t xml:space="preserve">The question</w:t>
+      </w:r>
+    </w:p>
+    <w:p>
+      <w:pPr>
+        <w:pStyle w:val="FirstParagraph"/>
+      </w:pPr>
+      <w:r>
+        <w:t xml:space="preserve">The project poses the question end to end: can published evidence be reliably extracted and</w:t>
+      </w:r>
+      <w:r>
+        <w:t xml:space="preserve"> </w:t>
+      </w:r>
+      <w:r>
+        <w:t xml:space="preserve">transported to the local setting to forecast the state of the care system when local data are</w:t>
+      </w:r>
+      <w:r>
+        <w:t xml:space="preserve"> </w:t>
+      </w:r>
+      <w:r>
+        <w:t xml:space="preserve">missing; can we detect early when it misleads; does any gain change operational decisions;</w:t>
+      </w:r>
+      <w:r>
+        <w:t xml:space="preserve"> </w:t>
+      </w:r>
+      <w:r>
+        <w:t xml:space="preserve">and can the complete chain run automatically, verified against observed outcomes, under</w:t>
+      </w:r>
+      <w:r>
+        <w:t xml:space="preserve"> </w:t>
+      </w:r>
+      <w:r>
+        <w:t xml:space="preserve">pre-registered rules?</w:t>
+      </w:r>
+    </w:p>
+    <w:p>
+      <w:pPr>
+        <w:pStyle w:val="BodyText"/>
+      </w:pPr>
+      <w:r>
+        <w:t xml:space="preserve">The project builds on existing ground: LiteRev-Evidence, the extraction and modelling</w:t>
+      </w:r>
+      <w:r>
+        <w:t xml:space="preserve"> </w:t>
+      </w:r>
+      <w:r>
+        <w:t xml:space="preserve">prototype I developed; the data cartography built for GESICA; and the ongoing Geneva</w:t>
+      </w:r>
+      <w:r>
+        <w:t xml:space="preserve"> </w:t>
+      </w:r>
+      <w:r>
+        <w:t xml:space="preserve">legionellosis study (BASEC 2026-00324), whose data work I lead.</w:t>
+      </w:r>
+    </w:p>
+    <w:bookmarkEnd w:id="21"/>
+    <w:bookmarkStart w:id="22" w:name="what-i-will-do-five-strands-48-months"/>
+    <w:p>
+      <w:pPr>
+        <w:pStyle w:val="Heading2"/>
+      </w:pPr>
+      <w:r>
+        <w:t xml:space="preserve">What I will do (five strands, 48 months)</w:t>
       </w:r>
     </w:p>
     <w:p>
@@ -130,28 +180,31 @@
           <w:bCs/>
           <w:b/>
         </w:rPr>
-        <w:t xml:space="preserve">LiteRev-Evidence</w:t>
-      </w:r>
-      <w:r>
-        <w:t xml:space="preserve">, the prototype I developed at the Institute (federated search of the</w:t>
-      </w:r>
-      <w:r>
-        <w:t xml:space="preserve"> </w:t>
-      </w:r>
-      <w:r>
-        <w:t xml:space="preserve">open literature, screening, provenance-tracked extraction, pooling into parameter</w:t>
-      </w:r>
-      <w:r>
-        <w:t xml:space="preserve"> </w:t>
-      </w:r>
-      <w:r>
-        <w:t xml:space="preserve">distributions, automated fitting and ranking of candidate models), already walks this</w:t>
-      </w:r>
-      <w:r>
-        <w:t xml:space="preserve"> </w:t>
-      </w:r>
-      <w:r>
-        <w:t xml:space="preserve">pipeline; the project turns it into a validated instrument and puts it to the test.</w:t>
+        <w:t xml:space="preserve">Extraction</w:t>
+      </w:r>
+      <w:r>
+        <w:t xml:space="preserve"> </w:t>
+      </w:r>
+      <w:r>
+        <w:t xml:space="preserve">- measure the reliability of automated extraction of quantitative</w:t>
+      </w:r>
+      <w:r>
+        <w:t xml:space="preserve"> </w:t>
+      </w:r>
+      <w:r>
+        <w:t xml:space="preserve">parameters from the literature, against a dual human-extraction benchmark, and correct the</w:t>
+      </w:r>
+      <w:r>
+        <w:t xml:space="preserve"> </w:t>
+      </w:r>
+      <w:r>
+        <w:t xml:space="preserve">identified biases; the literature also supplies explanatory variables, recommended model</w:t>
+      </w:r>
+      <w:r>
+        <w:t xml:space="preserve"> </w:t>
+      </w:r>
+      <w:r>
+        <w:t xml:space="preserve">families and outcome and threshold definitions.</w:t>
       </w:r>
     </w:p>
     <w:p>
@@ -167,37 +220,31 @@
           <w:bCs/>
           <w:b/>
         </w:rPr>
-        <w:t xml:space="preserve">GESICA</w:t>
-      </w:r>
-      <w:r>
-        <w:t xml:space="preserve"> </w:t>
-      </w:r>
-      <w:r>
-        <w:t xml:space="preserve">supplies the data cartography (a referenced inventory of 28 surveillance sources)</w:t>
-      </w:r>
-      <w:r>
-        <w:t xml:space="preserve"> </w:t>
-      </w:r>
-      <w:r>
-        <w:t xml:space="preserve">and the working relationships with HUG emergency medicine and the CASU-144 dispatch centre;</w:t>
-      </w:r>
-      <w:r>
-        <w:t xml:space="preserve"> </w:t>
-      </w:r>
-      <w:r>
-        <w:t xml:space="preserve">our joint systematic review of AI in prehospital emergency medicine (submitted 2026) shows</w:t>
-      </w:r>
-      <w:r>
-        <w:t xml:space="preserve"> </w:t>
-      </w:r>
-      <w:r>
-        <w:t xml:space="preserve">that forecasting is the most-addressed task and that uncertainty, transparency and</w:t>
-      </w:r>
-      <w:r>
-        <w:t xml:space="preserve"> </w:t>
-      </w:r>
-      <w:r>
-        <w:t xml:space="preserve">explainability are rarely treated.</w:t>
+        <w:t xml:space="preserve">Modelling</w:t>
+      </w:r>
+      <w:r>
+        <w:t xml:space="preserve"> </w:t>
+      </w:r>
+      <w:r>
+        <w:t xml:space="preserve">- represent the state of the care system as a latent regime process</w:t>
+      </w:r>
+      <w:r>
+        <w:t xml:space="preserve"> </w:t>
+      </w:r>
+      <w:r>
+        <w:t xml:space="preserve">(routine / elevated / strained / critical) rather than a threshold applied to a point</w:t>
+      </w:r>
+      <w:r>
+        <w:t xml:space="preserve"> </w:t>
+      </w:r>
+      <w:r>
+        <w:t xml:space="preserve">forecast; epidemiological models (SEIR-type) enter only for epidemiological crises,</w:t>
+      </w:r>
+      <w:r>
+        <w:t xml:space="preserve"> </w:t>
+      </w:r>
+      <w:r>
+        <w:t xml:space="preserve">environmental crises being driven by exposure-response structures.</w:t>
       </w:r>
     </w:p>
     <w:p>
@@ -213,190 +260,38 @@
           <w:bCs/>
           <w:b/>
         </w:rPr>
-        <w:t xml:space="preserve">The Geneva legionellosis study</w:t>
-      </w:r>
-      <w:r>
-        <w:t xml:space="preserve"> </w:t>
-      </w:r>
-      <w:r>
-        <w:t xml:space="preserve">(BASEC 2026-00324, ethics granted), whose data work I</w:t>
-      </w:r>
-      <w:r>
-        <w:t xml:space="preserve"> </w:t>
-      </w:r>
-      <w:r>
-        <w:t xml:space="preserve">lead, supplies the contrasting extension archetype.</w:t>
-      </w:r>
-    </w:p>
-    <w:bookmarkEnd w:id="21"/>
-    <w:bookmarkStart w:id="22" w:name="X39a0c938b9e07e05f07b79a12007108639c825f"/>
-    <w:p>
-      <w:pPr>
-        <w:pStyle w:val="Heading2"/>
-      </w:pPr>
-      <w:r>
-        <w:t xml:space="preserve">What the project does (five strands, 48 months)</w:t>
+        <w:t xml:space="preserve">Evaluation</w:t>
+      </w:r>
+      <w:r>
+        <w:t xml:space="preserve"> </w:t>
+      </w:r>
+      <w:r>
+        <w:t xml:space="preserve">- test, historical episode by historical episode, whether literature-derived</w:t>
+      </w:r>
+      <w:r>
+        <w:t xml:space="preserve"> </w:t>
+      </w:r>
+      <w:r>
+        <w:t xml:space="preserve">priors improve early-crisis forecasts, using at each moment only the data and the</w:t>
+      </w:r>
+      <w:r>
+        <w:t xml:space="preserve"> </w:t>
+      </w:r>
+      <w:r>
+        <w:t xml:space="preserve">literature available at that date, with automated selection of the best model under</w:t>
+      </w:r>
+      <w:r>
+        <w:t xml:space="preserve"> </w:t>
+      </w:r>
+      <w:r>
+        <w:t xml:space="preserve">pre-registered rules.</w:t>
       </w:r>
     </w:p>
     <w:p>
       <w:pPr>
         <w:numPr>
           <w:ilvl w:val="0"/>
-          <w:numId w:val="1002"/>
-        </w:numPr>
-        <w:pStyle w:val="Compact"/>
-      </w:pPr>
-      <w:r>
-        <w:rPr>
-          <w:bCs/>
-          <w:b/>
-        </w:rPr>
-        <w:t xml:space="preserve">Extraction</w:t>
-      </w:r>
-      <w:r>
-        <w:t xml:space="preserve"> </w:t>
-      </w:r>
-      <w:r>
-        <w:t xml:space="preserve">- measure the reliability of automated extraction of quantitative parameters</w:t>
-      </w:r>
-      <w:r>
-        <w:t xml:space="preserve"> </w:t>
-      </w:r>
-      <w:r>
-        <w:t xml:space="preserve">from the literature (against a dual human-extraction benchmark) and correct the identified</w:t>
-      </w:r>
-      <w:r>
-        <w:t xml:space="preserve"> </w:t>
-      </w:r>
-      <w:r>
-        <w:t xml:space="preserve">biases; the literature also supplies explanatory variables, recommended model families and</w:t>
-      </w:r>
-      <w:r>
-        <w:t xml:space="preserve"> </w:t>
-      </w:r>
-      <w:r>
-        <w:t xml:space="preserve">outcome and threshold definitions, transported to the local setting.</w:t>
-      </w:r>
-    </w:p>
-    <w:p>
-      <w:pPr>
-        <w:numPr>
-          <w:ilvl w:val="0"/>
-          <w:numId w:val="1002"/>
-        </w:numPr>
-        <w:pStyle w:val="Compact"/>
-      </w:pPr>
-      <w:r>
-        <w:rPr>
-          <w:bCs/>
-          <w:b/>
-        </w:rPr>
-        <w:t xml:space="preserve">Modelling</w:t>
-      </w:r>
-      <w:r>
-        <w:t xml:space="preserve"> </w:t>
-      </w:r>
-      <w:r>
-        <w:t xml:space="preserve">- represent the state of the care system as a</w:t>
-      </w:r>
-      <w:r>
-        <w:t xml:space="preserve"> </w:t>
-      </w:r>
-      <w:r>
-        <w:rPr>
-          <w:bCs/>
-          <w:b/>
-        </w:rPr>
-        <w:t xml:space="preserve">latent regime process</w:t>
-      </w:r>
-      <w:r>
-        <w:t xml:space="preserve"> </w:t>
-      </w:r>
-      <w:r>
-        <w:t xml:space="preserve">(routine / elevated / strained / critical) rather than a threshold applied to a point</w:t>
-      </w:r>
-      <w:r>
-        <w:t xml:space="preserve"> </w:t>
-      </w:r>
-      <w:r>
-        <w:t xml:space="preserve">forecast; epidemiological models (SEIR-type) enter only for epidemiological crises,</w:t>
-      </w:r>
-      <w:r>
-        <w:t xml:space="preserve"> </w:t>
-      </w:r>
-      <w:r>
-        <w:t xml:space="preserve">environmental crises being driven by exposure-response structures.</w:t>
-      </w:r>
-    </w:p>
-    <w:p>
-      <w:pPr>
-        <w:numPr>
-          <w:ilvl w:val="0"/>
-          <w:numId w:val="1002"/>
-        </w:numPr>
-        <w:pStyle w:val="Compact"/>
-      </w:pPr>
-      <w:r>
-        <w:rPr>
-          <w:bCs/>
-          <w:b/>
-        </w:rPr>
-        <w:t xml:space="preserve">Evaluation</w:t>
-      </w:r>
-      <w:r>
-        <w:t xml:space="preserve"> </w:t>
-      </w:r>
-      <w:r>
-        <w:t xml:space="preserve">- test, historical episode by historical episode, whether literature-derived</w:t>
-      </w:r>
-      <w:r>
-        <w:t xml:space="preserve"> </w:t>
-      </w:r>
-      <w:r>
-        <w:t xml:space="preserve">priors improve early-crisis forecasts, using at each moment only the data</w:t>
-      </w:r>
-      <w:r>
-        <w:t xml:space="preserve"> </w:t>
-      </w:r>
-      <w:r>
-        <w:rPr>
-          <w:iCs/>
-          <w:i/>
-        </w:rPr>
-        <w:t xml:space="preserve">and the</w:t>
-      </w:r>
-      <w:r>
-        <w:rPr>
-          <w:iCs/>
-          <w:i/>
-        </w:rPr>
-        <w:t xml:space="preserve"> </w:t>
-      </w:r>
-      <w:r>
-        <w:rPr>
-          <w:iCs/>
-          <w:i/>
-        </w:rPr>
-        <w:t xml:space="preserve">literature</w:t>
-      </w:r>
-      <w:r>
-        <w:t xml:space="preserve"> </w:t>
-      </w:r>
-      <w:r>
-        <w:t xml:space="preserve">available at that date, with automated selection of the best model under</w:t>
-      </w:r>
-      <w:r>
-        <w:t xml:space="preserve"> </w:t>
-      </w:r>
-      <w:r>
-        <w:t xml:space="preserve">pre-registered rules.</w:t>
-      </w:r>
-    </w:p>
-    <w:p>
-      <w:pPr>
-        <w:numPr>
-          <w:ilvl w:val="0"/>
-          <w:numId w:val="1002"/>
+          <w:numId w:val="1001"/>
         </w:numPr>
         <w:pStyle w:val="Compact"/>
       </w:pPr>
@@ -411,20 +306,7 @@
         <w:t xml:space="preserve"> </w:t>
       </w:r>
       <w:r>
-        <w:t xml:space="preserve">- evaluate not statistical accuracy but</w:t>
-      </w:r>
-      <w:r>
-        <w:t xml:space="preserve"> </w:t>
-      </w:r>
-      <w:r>
-        <w:rPr>
-          <w:bCs/>
-          <w:b/>
-        </w:rPr>
-        <w:t xml:space="preserve">decision benefit</w:t>
-      </w:r>
-      <w:r>
-        <w:t xml:space="preserve">, from escalation</w:t>
+        <w:t xml:space="preserve">- evaluate not statistical accuracy but decision benefit, from escalation</w:t>
       </w:r>
       <w:r>
         <w:t xml:space="preserve"> </w:t>
@@ -443,7 +325,7 @@
       <w:pPr>
         <w:numPr>
           <w:ilvl w:val="0"/>
-          <w:numId w:val="1002"/>
+          <w:numId w:val="1001"/>
         </w:numPr>
         <w:pStyle w:val="Compact"/>
       </w:pPr>
@@ -476,7 +358,31 @@
         <w:t xml:space="preserve"> </w:t>
       </w:r>
       <w:r>
-        <w:t xml:space="preserve">authorisation, a</w:t>
+        <w:t xml:space="preserve">authorisation, a daily observation-mode dashboard, recorded and evaluated prospectively,</w:t>
+      </w:r>
+      <w:r>
+        <w:t xml:space="preserve"> </w:t>
+      </w:r>
+      <w:r>
+        <w:t xml:space="preserve">never decisional during the project.</w:t>
+      </w:r>
+    </w:p>
+    <w:bookmarkEnd w:id="22"/>
+    <w:bookmarkStart w:id="23" w:name="how-it-will-be-tested"/>
+    <w:p>
+      <w:pPr>
+        <w:pStyle w:val="Heading2"/>
+      </w:pPr>
+      <w:r>
+        <w:t xml:space="preserve">How it will be tested</w:t>
+      </w:r>
+    </w:p>
+    <w:p>
+      <w:pPr>
+        <w:pStyle w:val="FirstParagraph"/>
+      </w:pPr>
+      <w:r>
+        <w:t xml:space="preserve">Three Geneva archetypes, fixed for the whole project:</w:t>
       </w:r>
       <w:r>
         <w:t xml:space="preserve"> </w:t>
@@ -486,26 +392,101 @@
           <w:bCs/>
           <w:b/>
         </w:rPr>
-        <w:t xml:space="preserve">daily observation-mode dashboard</w:t>
-      </w:r>
-      <w:r>
-        <w:t xml:space="preserve">, recorded and evaluated prospectively</w:t>
-      </w:r>
-      <w:r>
-        <w:t xml:space="preserve"> </w:t>
-      </w:r>
-      <w:r>
-        <w:t xml:space="preserve">against observed outcomes, never decisional during the project.</w:t>
-      </w:r>
-    </w:p>
-    <w:bookmarkEnd w:id="22"/>
-    <w:bookmarkStart w:id="23" w:name="data-and-the-regulatory-route"/>
+        <w:t xml:space="preserve">respiratory epidemics</w:t>
+      </w:r>
+      <w:r>
+        <w:t xml:space="preserve"> </w:t>
+      </w:r>
+      <w:r>
+        <w:t xml:space="preserve">(SARS-CoV-2,</w:t>
+      </w:r>
+      <w:r>
+        <w:t xml:space="preserve"> </w:t>
+      </w:r>
+      <w:r>
+        <w:t xml:space="preserve">influenza, RSV) carry the confirmatory test;</w:t>
+      </w:r>
+      <w:r>
+        <w:t xml:space="preserve"> </w:t>
+      </w:r>
+      <w:r>
+        <w:rPr>
+          <w:bCs/>
+          <w:b/>
+        </w:rPr>
+        <w:t xml:space="preserve">heatwaves</w:t>
+      </w:r>
+      <w:r>
+        <w:t xml:space="preserve"> </w:t>
+      </w:r>
+      <w:r>
+        <w:t xml:space="preserve">(with air pollution as</w:t>
+      </w:r>
+      <w:r>
+        <w:t xml:space="preserve"> </w:t>
+      </w:r>
+      <w:r>
+        <w:t xml:space="preserve">co-exposure) carry the generalisation test, run only if the first succeeds; Geneva</w:t>
+      </w:r>
+      <w:r>
+        <w:t xml:space="preserve"> </w:t>
+      </w:r>
+      <w:r>
+        <w:rPr>
+          <w:bCs/>
+          <w:b/>
+        </w:rPr>
+        <w:t xml:space="preserve">legionellosis</w:t>
+      </w:r>
+      <w:r>
+        <w:t xml:space="preserve"> </w:t>
+      </w:r>
+      <w:r>
+        <w:t xml:space="preserve">is the contrasting fourth-year extension (case incidence). Two arms - with</w:t>
+      </w:r>
+      <w:r>
+        <w:t xml:space="preserve"> </w:t>
+      </w:r>
+      <w:r>
+        <w:t xml:space="preserve">and without evidence - pass through the same pre-registered automated selection; the</w:t>
+      </w:r>
+      <w:r>
+        <w:t xml:space="preserve"> </w:t>
+      </w:r>
+      <w:r>
+        <w:t xml:space="preserve">machinery is validated first, end to end, on</w:t>
+      </w:r>
+      <w:r>
+        <w:t xml:space="preserve"> </w:t>
+      </w:r>
+      <w:r>
+        <w:rPr>
+          <w:bCs/>
+          <w:b/>
+        </w:rPr>
+        <w:t xml:space="preserve">open public data</w:t>
+      </w:r>
+      <w:r>
+        <w:t xml:space="preserve"> </w:t>
+      </w:r>
+      <w:r>
+        <w:t xml:space="preserve">(a public benchmark), then</w:t>
+      </w:r>
+      <w:r>
+        <w:t xml:space="preserve"> </w:t>
+      </w:r>
+      <w:r>
+        <w:t xml:space="preserve">on Geneva’s operational series.</w:t>
+      </w:r>
+    </w:p>
+    <w:bookmarkEnd w:id="23"/>
+    <w:bookmarkStart w:id="24" w:name="the-data"/>
     <w:p>
       <w:pPr>
         <w:pStyle w:val="Heading2"/>
       </w:pPr>
       <w:r>
-        <w:t xml:space="preserve">Data and the regulatory route</w:t>
+        <w:t xml:space="preserve">The data</w:t>
       </w:r>
     </w:p>
     <w:p>
@@ -513,7 +494,7 @@
         <w:pStyle w:val="FirstParagraph"/>
       </w:pPr>
       <w:r>
-        <w:t xml:space="preserve">The project uses only</w:t>
+        <w:t xml:space="preserve">Only</w:t>
       </w:r>
       <w:r>
         <w:t xml:space="preserve"> </w:t>
@@ -526,34 +507,31 @@
         <w:t xml:space="preserve">retrospective extracts aggregated to daily counts</w:t>
       </w:r>
       <w:r>
-        <w:t xml:space="preserve"> </w:t>
-      </w:r>
-      <w:r>
-        <w:t xml:space="preserve">(no identifiers,</w:t>
-      </w:r>
-      <w:r>
-        <w:t xml:space="preserve"> </w:t>
-      </w:r>
-      <w:r>
-        <w:t xml:space="preserve">no individual-level data, no free text). The scope is the canton of Geneva: CASU-144 dispatch</w:t>
-      </w:r>
-      <w:r>
-        <w:t xml:space="preserve"> </w:t>
-      </w:r>
-      <w:r>
-        <w:t xml:space="preserve">data as the primary outcome series, emergency-department presentations and ICU occupancy as</w:t>
-      </w:r>
-      <w:r>
-        <w:t xml:space="preserve"> </w:t>
-      </w:r>
-      <w:r>
-        <w:t xml:space="preserve">complementary channels, the cantonal physician and pharmacist and SIG for the environmental</w:t>
-      </w:r>
-      <w:r>
-        <w:t xml:space="preserve"> </w:t>
-      </w:r>
-      <w:r>
-        <w:t xml:space="preserve">strands. The machinery is validated first, end to end, on</w:t>
+        <w:t xml:space="preserve">: no identifiers, no</w:t>
+      </w:r>
+      <w:r>
+        <w:t xml:space="preserve"> </w:t>
+      </w:r>
+      <w:r>
+        <w:t xml:space="preserve">individual-level data, no voice recordings, no free text. The scope is the canton of Geneva:</w:t>
+      </w:r>
+      <w:r>
+        <w:t xml:space="preserve"> </w:t>
+      </w:r>
+      <w:r>
+        <w:t xml:space="preserve">CASU-144 dispatch data as the primary outcome series; emergency-department presentations and</w:t>
+      </w:r>
+      <w:r>
+        <w:t xml:space="preserve"> </w:t>
+      </w:r>
+      <w:r>
+        <w:t xml:space="preserve">ICU occupancy as complementary channels; the cantonal physician and pharmacist and SIG for</w:t>
+      </w:r>
+      <w:r>
+        <w:t xml:space="preserve"> </w:t>
+      </w:r>
+      <w:r>
+        <w:t xml:space="preserve">the environmental strands. Operational access would follow the</w:t>
       </w:r>
       <w:r>
         <w:t xml:space="preserve"> </w:t>
@@ -563,64 +541,13 @@
           <w:bCs/>
           <w:b/>
         </w:rPr>
-        <w:t xml:space="preserve">open public data</w:t>
-      </w:r>
-      <w:r>
-        <w:t xml:space="preserve"> </w:t>
-      </w:r>
-      <w:r>
-        <w:t xml:space="preserve">(a public</w:t>
-      </w:r>
-      <w:r>
-        <w:t xml:space="preserve"> </w:t>
-      </w:r>
-      <w:r>
-        <w:t xml:space="preserve">benchmark); feasibility therefore rests on no single agreement. Operational access would</w:t>
-      </w:r>
-      <w:r>
-        <w:t xml:space="preserve"> </w:t>
-      </w:r>
-      <w:r>
-        <w:t xml:space="preserve">follow the</w:t>
-      </w:r>
-      <w:r>
-        <w:t xml:space="preserve"> </w:t>
+        <w:t xml:space="preserve">official route: a CCER</w:t>
       </w:r>
       <w:r>
         <w:rPr>
           <w:bCs/>
           <w:b/>
         </w:rPr>
-        <w:t xml:space="preserve">official route: a CCER submission with me as applicant</w:t>
-      </w:r>
-      <w:r>
-        <w:t xml:space="preserve">, preceded by</w:t>
-      </w:r>
-      <w:r>
-        <w:t xml:space="preserve"> </w:t>
-      </w:r>
-      <w:r>
-        <w:t xml:space="preserve">institutional data agreements prepared before month 1.</w:t>
-      </w:r>
-    </w:p>
-    <w:bookmarkEnd w:id="23"/>
-    <w:bookmarkStart w:id="24" w:name="hosting-and-independence"/>
-    <w:p>
-      <w:pPr>
-        <w:pStyle w:val="Heading2"/>
-      </w:pPr>
-      <w:r>
-        <w:t xml:space="preserve">Hosting and independence</w:t>
-      </w:r>
-    </w:p>
-    <w:p>
-      <w:pPr>
-        <w:pStyle w:val="FirstParagraph"/>
-      </w:pPr>
-      <w:r>
-        <w:t xml:space="preserve">The programme would run as an</w:t>
-      </w:r>
-      <w:r>
         <w:t xml:space="preserve"> </w:t>
       </w:r>
       <w:r>
@@ -628,114 +555,80 @@
           <w:bCs/>
           <w:b/>
         </w:rPr>
-        <w:t xml:space="preserve">independent research programme alongside the Institute of</w:t>
+        <w:t xml:space="preserve">submission with me as applicant</w:t>
+      </w:r>
+      <w:r>
+        <w:t xml:space="preserve">, preceded by institutional data agreements prepared before</w:t>
+      </w:r>
+      <w:r>
+        <w:t xml:space="preserve"> </w:t>
+      </w:r>
+      <w:r>
+        <w:t xml:space="preserve">month 1.</w:t>
+      </w:r>
+    </w:p>
+    <w:bookmarkEnd w:id="24"/>
+    <w:bookmarkStart w:id="25" w:name="team-and-timeline"/>
+    <w:p>
+      <w:pPr>
+        <w:pStyle w:val="Heading2"/>
+      </w:pPr>
+      <w:r>
+        <w:t xml:space="preserve">Team and timeline</w:t>
+      </w:r>
+    </w:p>
+    <w:p>
+      <w:pPr>
+        <w:pStyle w:val="FirstParagraph"/>
+      </w:pPr>
+      <w:r>
+        <w:t xml:space="preserve">An independent programme hosted at the Institute of Global Health, under the SNSF template</w:t>
+      </w:r>
+      <w:r>
+        <w:t xml:space="preserve"> </w:t>
+      </w:r>
+      <w:r>
+        <w:t xml:space="preserve">guarantees (the applicant’s scientific direction, team supervision, budget authority, senior</w:t>
+      </w:r>
+      <w:r>
+        <w:t xml:space="preserve"> </w:t>
+      </w:r>
+      <w:r>
+        <w:t xml:space="preserve">authorship). Team: the applicant, one scientific/technical collaborator (50%) and a</w:t>
+      </w:r>
+      <w:r>
+        <w:t xml:space="preserve"> </w:t>
+      </w:r>
+      <w:r>
+        <w:t xml:space="preserve">contracted independent extractor; SNSF project budget of CHF 250,000 over 4 years, the</w:t>
+      </w:r>
+      <w:r>
+        <w:t xml:space="preserve"> </w:t>
+      </w:r>
+      <w:r>
+        <w:t xml:space="preserve">applicant’s salary covered separately.</w:t>
+      </w:r>
+      <w:r>
+        <w:t xml:space="preserve"> </w:t>
       </w:r>
       <w:r>
         <w:rPr>
           <w:bCs/>
           <w:b/>
         </w:rPr>
-        <w:t xml:space="preserve"> </w:t>
-      </w:r>
-      <w:r>
-        <w:rPr>
-          <w:bCs/>
-          <w:b/>
-        </w:rPr>
-        <w:t xml:space="preserve">Global Health’s groups</w:t>
-      </w:r>
-      <w:r>
-        <w:t xml:space="preserve">, under the SNSF template guarantees (the applicant’s scientific</w:t>
-      </w:r>
-      <w:r>
-        <w:t xml:space="preserve"> </w:t>
-      </w:r>
-      <w:r>
-        <w:t xml:space="preserve">direction, selection and supervision of team members, budget authority, senior authorship),</w:t>
-      </w:r>
-      <w:r>
-        <w:t xml:space="preserve"> </w:t>
-      </w:r>
-      <w:r>
-        <w:t xml:space="preserve">with a methodological collaboration with DS4DH on the evidence-extraction work package.</w:t>
-      </w:r>
-      <w:r>
-        <w:t xml:space="preserve"> </w:t>
-      </w:r>
-      <w:r>
-        <w:rPr>
-          <w:bCs/>
-          <w:b/>
-        </w:rPr>
-        <w:t xml:space="preserve">No</w:t>
-      </w:r>
-      <w:r>
-        <w:rPr>
-          <w:bCs/>
-          <w:b/>
-        </w:rPr>
-        <w:t xml:space="preserve"> </w:t>
-      </w:r>
-      <w:r>
-        <w:rPr>
-          <w:bCs/>
-          <w:b/>
-        </w:rPr>
-        <w:t xml:space="preserve">financial implication for the partners</w:t>
-      </w:r>
-      <w:r>
-        <w:t xml:space="preserve">: the SNSF covers the applicant’s salary and a project</w:t>
-      </w:r>
-      <w:r>
-        <w:t xml:space="preserve"> </w:t>
-      </w:r>
-      <w:r>
-        <w:t xml:space="preserve">budget (CHF 250,000 over 4 years; doctoral students and postdocs excluded under the 2026</w:t>
-      </w:r>
-      <w:r>
-        <w:t xml:space="preserve"> </w:t>
-      </w:r>
-      <w:r>
-        <w:t xml:space="preserve">rules). What remains afterwards: the validated open instruments (extraction benchmark, public</w:t>
-      </w:r>
-      <w:r>
-        <w:t xml:space="preserve"> </w:t>
-      </w:r>
-      <w:r>
-        <w:t xml:space="preserve">cold-start benchmark, evidence-to-prior library), the dashboard nucleus, and joint</w:t>
-      </w:r>
-      <w:r>
-        <w:t xml:space="preserve"> </w:t>
-      </w:r>
-      <w:r>
-        <w:t xml:space="preserve">publications.</w:t>
-      </w:r>
-    </w:p>
-    <w:p>
-      <w:pPr>
-        <w:pStyle w:val="BodyText"/>
-      </w:pPr>
-      <w:r>
-        <w:rPr>
-          <w:bCs/>
-          <w:b/>
-        </w:rPr>
-        <w:t xml:space="preserve">Timeline.</w:t>
-      </w:r>
-      <w:r>
-        <w:t xml:space="preserve"> </w:t>
-      </w:r>
-      <w:r>
-        <w:t xml:space="preserve">Submission: 3 November 2026 · Decision: August 2027 · Start: between September</w:t>
-      </w:r>
-      <w:r>
-        <w:t xml:space="preserve"> </w:t>
-      </w:r>
-      <w:r>
-        <w:t xml:space="preserve">2027 and September 2028.</w:t>
-      </w:r>
-    </w:p>
-    <w:bookmarkEnd w:id="24"/>
+        <w:t xml:space="preserve">Timeline</w:t>
+      </w:r>
+      <w:r>
+        <w:t xml:space="preserve">: submission 3 November 2026 · decision</w:t>
+      </w:r>
+      <w:r>
+        <w:t xml:space="preserve"> </w:t>
+      </w:r>
+      <w:r>
+        <w:t xml:space="preserve">August 2027 · start between September 2027 and September 2028.</w:t>
+      </w:r>
+    </w:p>
+    <w:bookmarkEnd w:id="25"/>
     <w:sectPr>
       <w:pgSz w:h="16838" w:w="11906"/>
       <w:pgMar w:top="760" w:right="880" w:bottom="760" w:left="880" w:header="708" w:footer="708" w:gutter="0"/>
@@ -845,82 +738,6 @@
       </w:pPr>
     </w:lvl>
   </w:abstractNum>
-  <w:abstractNum w:abstractNumId="991">
-    <w:nsid w:val="A991"/>
-    <w:multiLevelType w:val="multilevel"/>
-    <w:lvl w:ilvl="0">
-      <w:numFmt w:val="bullet"/>
-      <w:lvlText w:val="•"/>
-      <w:lvlJc w:val="left"/>
-      <w:pPr>
-        <w:ind w:left="720" w:hanging="480"/>
-      </w:pPr>
-    </w:lvl>
-    <w:lvl w:ilvl="1">
-      <w:numFmt w:val="bullet"/>
-      <w:lvlText w:val="–"/>
-      <w:lvlJc w:val="left"/>
-      <w:pPr>
-        <w:ind w:left="1440" w:hanging="480"/>
-      </w:pPr>
-    </w:lvl>
-    <w:lvl w:ilvl="2">
-      <w:numFmt w:val="bullet"/>
-      <w:lvlText w:val="•"/>
-      <w:lvlJc w:val="left"/>
-      <w:pPr>
-        <w:ind w:left="2160" w:hanging="480"/>
-      </w:pPr>
-    </w:lvl>
-    <w:lvl w:ilvl="3">
-      <w:numFmt w:val="bullet"/>
-      <w:lvlText w:val="–"/>
-      <w:lvlJc w:val="left"/>
-      <w:pPr>
-        <w:ind w:left="2880" w:hanging="480"/>
-      </w:pPr>
-    </w:lvl>
-    <w:lvl w:ilvl="4">
-      <w:numFmt w:val="bullet"/>
-      <w:lvlText w:val="•"/>
-      <w:lvlJc w:val="left"/>
-      <w:pPr>
-        <w:ind w:left="3600" w:hanging="480"/>
-      </w:pPr>
-    </w:lvl>
-    <w:lvl w:ilvl="5">
-      <w:numFmt w:val="bullet"/>
-      <w:lvlText w:val="–"/>
-      <w:lvlJc w:val="left"/>
-      <w:pPr>
-        <w:ind w:left="4320" w:hanging="480"/>
-      </w:pPr>
-    </w:lvl>
-    <w:lvl w:ilvl="6">
-      <w:numFmt w:val="bullet"/>
-      <w:lvlText w:val="•"/>
-      <w:lvlJc w:val="left"/>
-      <w:pPr>
-        <w:ind w:left="5040" w:hanging="480"/>
-      </w:pPr>
-    </w:lvl>
-    <w:lvl w:ilvl="7">
-      <w:numFmt w:val="bullet"/>
-      <w:lvlText w:val="–"/>
-      <w:lvlJc w:val="left"/>
-      <w:pPr>
-        <w:ind w:left="5760" w:hanging="480"/>
-      </w:pPr>
-    </w:lvl>
-    <w:lvl w:ilvl="8">
-      <w:numFmt w:val="bullet"/>
-      <w:lvlText w:val="•"/>
-      <w:lvlJc w:val="left"/>
-      <w:pPr>
-        <w:ind w:left="6480" w:hanging="480"/>
-      </w:pPr>
-    </w:lvl>
-  </w:abstractNum>
   <w:abstractNum w:abstractNumId="99411">
     <w:nsid w:val="A99411"/>
     <w:multiLevelType w:val="multilevel"/>
@@ -1010,9 +827,6 @@
     <w:abstractNumId w:val="990"/>
   </w:num>
   <w:num w:numId="1001">
-    <w:abstractNumId w:val="991"/>
-  </w:num>
-  <w:num w:numId="1002">
     <w:abstractNumId w:val="99411"/>
     <w:lvlOverride w:ilvl="0">
       <w:startOverride w:val="1"/>

</xml_diff>

<commit_message>
English note rebuilt on applicant's French version; Douglas email simplified; Keiser slot confirmed, CC flow on Ray email
Co-Authored-By: Claude Fable 5 <noreply@anthropic.com>
Claude-Session: https://claude.ai/code/session_01Pijyy83JyS8bJxoVQgxwZB
</commit_message>
<xml_diff>
--- a/04-other-documents/data-access/02-project-note-en.docx
+++ b/04-other-documents/data-access/02-project-note-en.docx
@@ -19,19 +19,13 @@
         <w:pStyle w:val="BodyText"/>
       </w:pPr>
       <w:r>
-        <w:t xml:space="preserve">SNSF Ambizione application (submission: 3 November 2026) · Applicant: Dr Erol Orel · Proposed</w:t>
-      </w:r>
-      <w:r>
-        <w:t xml:space="preserve"> </w:t>
-      </w:r>
-      <w:r>
-        <w:t xml:space="preserve">host: Institute of Global Health, Faculty of Medicine, University of Geneva (independent</w:t>
-      </w:r>
-      <w:r>
-        <w:t xml:space="preserve"> </w:t>
-      </w:r>
-      <w:r>
-        <w:t xml:space="preserve">research programme) · Duration: 4 years</w:t>
+        <w:t xml:space="preserve">SNSF Ambizione application (submission: 3 November 2026) · Applicant: Dr Erol Orel · Host:</w:t>
+      </w:r>
+      <w:r>
+        <w:t xml:space="preserve"> </w:t>
+      </w:r>
+      <w:r>
+        <w:t xml:space="preserve">Institute of Global Health, Faculty of Medicine, University of Geneva · Duration: 4 years</w:t>
       </w:r>
     </w:p>
     <w:bookmarkStart w:id="20" w:name="the-problem"/>
@@ -148,23 +142,23 @@
         <w:t xml:space="preserve"> </w:t>
       </w:r>
       <w:r>
-        <w:t xml:space="preserve">prototype I developed; the data cartography built for GESICA; and the ongoing Geneva</w:t>
-      </w:r>
-      <w:r>
-        <w:t xml:space="preserve"> </w:t>
-      </w:r>
-      <w:r>
-        <w:t xml:space="preserve">legionellosis study (BASEC 2026-00324), whose data work I lead.</w:t>
+        <w:t xml:space="preserve">prototype under development; the data cartography built for GESICA; and the ongoing Geneva</w:t>
+      </w:r>
+      <w:r>
+        <w:t xml:space="preserve"> </w:t>
+      </w:r>
+      <w:r>
+        <w:t xml:space="preserve">legionellosis study (BASEC 2026-00324).</w:t>
       </w:r>
     </w:p>
     <w:bookmarkEnd w:id="21"/>
-    <w:bookmarkStart w:id="22" w:name="what-i-will-do-five-strands-48-months"/>
+    <w:bookmarkStart w:id="22" w:name="five-strands"/>
     <w:p>
       <w:pPr>
         <w:pStyle w:val="Heading2"/>
       </w:pPr>
       <w:r>
-        <w:t xml:space="preserve">What I will do (five strands, 48 months)</w:t>
+        <w:t xml:space="preserve">Five strands</w:t>
       </w:r>
     </w:p>
     <w:p>
@@ -346,25 +340,25 @@
         <w:t xml:space="preserve"> </w:t>
       </w:r>
       <w:r>
-        <w:t xml:space="preserve">each variable’s cadence; statistical assumptions checked on every fit; daily literature</w:t>
-      </w:r>
-      <w:r>
-        <w:t xml:space="preserve"> </w:t>
-      </w:r>
-      <w:r>
-        <w:t xml:space="preserve">monitoring; at the end of the project, for validated event types and subject to</w:t>
-      </w:r>
-      <w:r>
-        <w:t xml:space="preserve"> </w:t>
-      </w:r>
-      <w:r>
-        <w:t xml:space="preserve">authorisation, a daily observation-mode dashboard, recorded and evaluated prospectively,</w:t>
-      </w:r>
-      <w:r>
-        <w:t xml:space="preserve"> </w:t>
-      </w:r>
-      <w:r>
-        <w:t xml:space="preserve">never decisional during the project.</w:t>
+        <w:t xml:space="preserve">each variable’s cadence; statistical assumptions checked; daily literature monitoring; at</w:t>
+      </w:r>
+      <w:r>
+        <w:t xml:space="preserve"> </w:t>
+      </w:r>
+      <w:r>
+        <w:t xml:space="preserve">the end of the project, for validated event types and subject to authorisation, a daily</w:t>
+      </w:r>
+      <w:r>
+        <w:t xml:space="preserve"> </w:t>
+      </w:r>
+      <w:r>
+        <w:t xml:space="preserve">observation-mode dashboard, recorded and evaluated prospectively, never decisional during</w:t>
+      </w:r>
+      <w:r>
+        <w:t xml:space="preserve"> </w:t>
+      </w:r>
+      <w:r>
+        <w:t xml:space="preserve">the project.</w:t>
       </w:r>
     </w:p>
     <w:bookmarkEnd w:id="22"/>
@@ -519,116 +513,28 @@
         <w:t xml:space="preserve"> </w:t>
       </w:r>
       <w:r>
-        <w:t xml:space="preserve">CASU-144 dispatch data as the primary outcome series; emergency-department presentations and</w:t>
-      </w:r>
-      <w:r>
-        <w:t xml:space="preserve"> </w:t>
-      </w:r>
-      <w:r>
-        <w:t xml:space="preserve">ICU occupancy as complementary channels; the cantonal physician and pharmacist and SIG for</w:t>
-      </w:r>
-      <w:r>
-        <w:t xml:space="preserve"> </w:t>
-      </w:r>
-      <w:r>
-        <w:t xml:space="preserve">the environmental strands. Operational access would follow the</w:t>
-      </w:r>
-      <w:r>
-        <w:t xml:space="preserve"> </w:t>
-      </w:r>
-      <w:r>
-        <w:rPr>
-          <w:bCs/>
-          <w:b/>
-        </w:rPr>
-        <w:t xml:space="preserve">official route: a CCER</w:t>
-      </w:r>
-      <w:r>
-        <w:rPr>
-          <w:bCs/>
-          <w:b/>
-        </w:rPr>
-        <w:t xml:space="preserve"> </w:t>
-      </w:r>
-      <w:r>
-        <w:rPr>
-          <w:bCs/>
-          <w:b/>
-        </w:rPr>
-        <w:t xml:space="preserve">submission with me as applicant</w:t>
-      </w:r>
-      <w:r>
-        <w:t xml:space="preserve">, preceded by institutional data agreements prepared before</w:t>
-      </w:r>
-      <w:r>
-        <w:t xml:space="preserve"> </w:t>
-      </w:r>
-      <w:r>
-        <w:t xml:space="preserve">month 1.</w:t>
+        <w:t xml:space="preserve">CASU-144 dispatch data; emergency-department presentations and ICU occupancy; the cantonal</w:t>
+      </w:r>
+      <w:r>
+        <w:t xml:space="preserve"> </w:t>
+      </w:r>
+      <w:r>
+        <w:t xml:space="preserve">physician and pharmacist and SIG for the environmental strands. Plus all other freely</w:t>
+      </w:r>
+      <w:r>
+        <w:t xml:space="preserve"> </w:t>
+      </w:r>
+      <w:r>
+        <w:t xml:space="preserve">available data (climate, demographics, etc.). Operational access would follow the official</w:t>
+      </w:r>
+      <w:r>
+        <w:t xml:space="preserve"> </w:t>
+      </w:r>
+      <w:r>
+        <w:t xml:space="preserve">route: a CCER submission.</w:t>
       </w:r>
     </w:p>
     <w:bookmarkEnd w:id="24"/>
-    <w:bookmarkStart w:id="25" w:name="team-and-timeline"/>
-    <w:p>
-      <w:pPr>
-        <w:pStyle w:val="Heading2"/>
-      </w:pPr>
-      <w:r>
-        <w:t xml:space="preserve">Team and timeline</w:t>
-      </w:r>
-    </w:p>
-    <w:p>
-      <w:pPr>
-        <w:pStyle w:val="FirstParagraph"/>
-      </w:pPr>
-      <w:r>
-        <w:t xml:space="preserve">An independent programme hosted at the Institute of Global Health, under the SNSF template</w:t>
-      </w:r>
-      <w:r>
-        <w:t xml:space="preserve"> </w:t>
-      </w:r>
-      <w:r>
-        <w:t xml:space="preserve">guarantees (the applicant’s scientific direction, team supervision, budget authority, senior</w:t>
-      </w:r>
-      <w:r>
-        <w:t xml:space="preserve"> </w:t>
-      </w:r>
-      <w:r>
-        <w:t xml:space="preserve">authorship). Team: the applicant, one scientific/technical collaborator (50%) and a</w:t>
-      </w:r>
-      <w:r>
-        <w:t xml:space="preserve"> </w:t>
-      </w:r>
-      <w:r>
-        <w:t xml:space="preserve">contracted independent extractor; SNSF project budget of CHF 250,000 over 4 years, the</w:t>
-      </w:r>
-      <w:r>
-        <w:t xml:space="preserve"> </w:t>
-      </w:r>
-      <w:r>
-        <w:t xml:space="preserve">applicant’s salary covered separately.</w:t>
-      </w:r>
-      <w:r>
-        <w:t xml:space="preserve"> </w:t>
-      </w:r>
-      <w:r>
-        <w:rPr>
-          <w:bCs/>
-          <w:b/>
-        </w:rPr>
-        <w:t xml:space="preserve">Timeline</w:t>
-      </w:r>
-      <w:r>
-        <w:t xml:space="preserve">: submission 3 November 2026 · decision</w:t>
-      </w:r>
-      <w:r>
-        <w:t xml:space="preserve"> </w:t>
-      </w:r>
-      <w:r>
-        <w:t xml:space="preserve">August 2027 · start between September 2027 and September 2028.</w:t>
-      </w:r>
-    </w:p>
-    <w:bookmarkEnd w:id="25"/>
     <w:sectPr>
       <w:pgSz w:h="16838" w:w="11906"/>
       <w:pgMar w:top="760" w:right="880" w:bottom="760" w:left="880" w:header="708" w:footer="708" w:gutter="0"/>

</xml_diff>